<commit_message>
Updated the links in the respective documents
</commit_message>
<xml_diff>
--- a/Chapter_02_Prompt_Engineering/Assignment_01_RICEPOT_Framework/Artefacts/PROMPT to GENERATE TEST PLAN using RICE POT Framework.docx
+++ b/Chapter_02_Prompt_Engineering/Assignment_01_RICEPOT_Framework/Artefacts/PROMPT to GENERATE TEST PLAN using RICE POT Framework.docx
@@ -727,6 +727,12 @@
       </w:r>
     </w:p>
     <w:p>
+      <w:pPr>
+        <w:rPr>
+          <w:b/>
+          <w:bCs/>
+        </w:rPr>
+      </w:pPr>
       <w:r>
         <w:rPr>
           <w:b/>
@@ -734,23 +740,33 @@
         </w:rPr>
         <w:t>Test Plan Template:</w:t>
       </w:r>
-      <w:r>
-        <w:rPr>
-          <w:b/>
-          <w:bCs/>
-        </w:rPr>
-        <w:br/>
-      </w:r>
-      <w:hyperlink r:id="rId5" w:history="1">
-        <w:r>
-          <w:rPr>
-            <w:rStyle w:val="Hyperlink"/>
-          </w:rPr>
-          <w:t>Test Plan</w:t>
-        </w:r>
-      </w:hyperlink>
-    </w:p>
-    <w:p>
+    </w:p>
+    <w:p>
+      <w:pPr>
+        <w:rPr>
+          <w:rStyle w:val="Hyperlink"/>
+        </w:rPr>
+      </w:pPr>
+      <w:r>
+        <w:fldChar w:fldCharType="begin"/>
+      </w:r>
+      <w:r>
+        <w:instrText>HYPERLINK "https://github.com/simran-s02/AI-Tester-Blueprint-4x/blob/main/Chapter_02_Prompt_Engineering/Assignment_01_RICEPOT_Framework/Assets/Test%20Plan%20-%20Template.docx.pdf" \o "Test Plan"</w:instrText>
+      </w:r>
+      <w:r>
+        <w:fldChar w:fldCharType="separate"/>
+      </w:r>
+      <w:r>
+        <w:rPr>
+          <w:rStyle w:val="Hyperlink"/>
+        </w:rPr>
+        <w:t>AI-Tester-Blueprint-4x/Chapter_02_Prompt_Engineering/Assignment_01_RICEPOT_Framework/Assets/Test Plan - Template.docx.pdf at main · simran-s02/AI-Tester-Blueprint-4x</w:t>
+      </w:r>
+    </w:p>
+    <w:p>
+      <w:r>
+        <w:fldChar w:fldCharType="end"/>
+      </w:r>
       <w:r>
         <w:rPr>
           <w:b/>
@@ -835,6 +851,7 @@
           <w:b/>
           <w:bCs/>
         </w:rPr>
+        <w:lastRenderedPageBreak/>
         <w:t>P – P</w:t>
       </w:r>
       <w:r>
@@ -876,7 +893,6 @@
         </w:tabs>
       </w:pPr>
       <w:r>
-        <w:lastRenderedPageBreak/>
         <w:t>Product Requirement Document (PRD)</w:t>
       </w:r>
     </w:p>
@@ -1217,6 +1233,7 @@
         </w:numPr>
       </w:pPr>
       <w:r>
+        <w:lastRenderedPageBreak/>
         <w:t>Match the template structure exactly.</w:t>
       </w:r>
     </w:p>
@@ -1239,7 +1256,6 @@
         </w:numPr>
       </w:pPr>
       <w:r>
-        <w:lastRenderedPageBreak/>
         <w:t>Format the output using GitHub-flavo</w:t>
       </w:r>
       <w:r>

</xml_diff>